<commit_message>
Pdf document with answers added
Included is a .docx version, in case changes need to be made
</commit_message>
<xml_diff>
--- a/Answers.docx
+++ b/Answers.docx
@@ -142,31 +142,33 @@
           <w:lang w:val="en-US"/>
         </w:rPr>
         <w:br/>
-        <w:t xml:space="preserve">Component – </w:t>
-      </w:r>
-      <w:proofErr w:type="spellStart"/>
-      <w:r>
-        <w:rPr>
-          <w:lang w:val="en-US"/>
-        </w:rPr>
-        <w:t>EventComponent</w:t>
-      </w:r>
-      <w:proofErr w:type="spellEnd"/>
-      <w:r>
-        <w:rPr>
-          <w:lang w:val="en-US"/>
-        </w:rPr>
-        <w:br/>
-        <w:t xml:space="preserve">Composite – Event, Zone, </w:t>
-      </w:r>
-      <w:proofErr w:type="spellStart"/>
-      <w:r>
-        <w:rPr>
-          <w:lang w:val="en-US"/>
-        </w:rPr>
-        <w:t>OutdoorVenu</w:t>
-      </w:r>
-      <w:proofErr w:type="spellEnd"/>
+        <w:t>Component – EventComponent</w:t>
+      </w:r>
+      <w:r>
+        <w:rPr>
+          <w:lang w:val="en-US"/>
+        </w:rPr>
+        <w:br/>
+        <w:t xml:space="preserve">Composite – </w:t>
+      </w:r>
+      <w:r>
+        <w:rPr>
+          <w:lang w:val="en-US"/>
+        </w:rPr>
+        <w:t>FilmShowing, SpecialEvent</w:t>
+      </w:r>
+      <w:r>
+        <w:rPr>
+          <w:lang w:val="en-US"/>
+        </w:rPr>
+        <w:t>, Zone, OutdoorVenu</w:t>
+      </w:r>
+      <w:r>
+        <w:rPr>
+          <w:lang w:val="en-US"/>
+        </w:rPr>
+        <w:t>e</w:t>
+      </w:r>
       <w:r>
         <w:rPr>
           <w:lang w:val="en-US"/>
@@ -189,78 +191,14 @@
         <w:rPr>
           <w:lang w:val="en-US"/>
         </w:rPr>
-        <w:t xml:space="preserve"> – </w:t>
-      </w:r>
-      <w:proofErr w:type="spellStart"/>
-      <w:r>
-        <w:rPr>
-          <w:lang w:val="en-US"/>
-        </w:rPr>
-        <w:t>ScreeningArea</w:t>
-      </w:r>
-      <w:proofErr w:type="spellEnd"/>
-      <w:r>
-        <w:rPr>
-          <w:lang w:val="en-US"/>
-        </w:rPr>
-        <w:t xml:space="preserve">, </w:t>
-      </w:r>
-      <w:proofErr w:type="spellStart"/>
-      <w:r>
-        <w:rPr>
-          <w:lang w:val="en-US"/>
-        </w:rPr>
-        <w:t>TicketDesk</w:t>
-      </w:r>
-      <w:proofErr w:type="spellEnd"/>
-      <w:r>
-        <w:rPr>
-          <w:lang w:val="en-US"/>
-        </w:rPr>
-        <w:t xml:space="preserve">, </w:t>
-      </w:r>
-      <w:proofErr w:type="spellStart"/>
-      <w:r>
-        <w:rPr>
-          <w:lang w:val="en-US"/>
-        </w:rPr>
-        <w:t>InformationDesk</w:t>
-      </w:r>
-      <w:proofErr w:type="spellEnd"/>
-      <w:r>
-        <w:rPr>
-          <w:lang w:val="en-US"/>
-        </w:rPr>
-        <w:t xml:space="preserve">, </w:t>
-      </w:r>
-      <w:proofErr w:type="spellStart"/>
-      <w:r>
-        <w:rPr>
-          <w:lang w:val="en-US"/>
-        </w:rPr>
-        <w:t>Food</w:t>
-      </w:r>
-      <w:r>
-        <w:rPr>
-          <w:lang w:val="en-US"/>
-        </w:rPr>
-        <w:t>Area</w:t>
-      </w:r>
-      <w:proofErr w:type="spellEnd"/>
-      <w:r>
-        <w:rPr>
-          <w:lang w:val="en-US"/>
-        </w:rPr>
-        <w:t xml:space="preserve">, </w:t>
-      </w:r>
-      <w:proofErr w:type="spellStart"/>
-      <w:r>
-        <w:rPr>
-          <w:lang w:val="en-US"/>
-        </w:rPr>
-        <w:t>SpecialEventArea</w:t>
-      </w:r>
-      <w:proofErr w:type="spellEnd"/>
+        <w:t xml:space="preserve"> – ScreeningArea, TicketDesk, InformationDesk, Food</w:t>
+      </w:r>
+      <w:r>
+        <w:rPr>
+          <w:lang w:val="en-US"/>
+        </w:rPr>
+        <w:t>Area, SpecialEventArea</w:t>
+      </w:r>
       <w:r>
         <w:rPr>
           <w:lang w:val="en-US"/>
@@ -286,43 +224,8 @@
           <w:lang w:val="en-US"/>
         </w:rPr>
         <w:br/>
-      </w:r>
-      <w:proofErr w:type="spellStart"/>
-      <w:r>
-        <w:rPr>
-          <w:lang w:val="en-US"/>
-        </w:rPr>
-        <w:t>ConcreteObserver</w:t>
-      </w:r>
-      <w:proofErr w:type="spellEnd"/>
-      <w:r>
-        <w:rPr>
-          <w:lang w:val="en-US"/>
-        </w:rPr>
-        <w:t xml:space="preserve"> – </w:t>
-      </w:r>
-      <w:proofErr w:type="spellStart"/>
-      <w:r>
-        <w:rPr>
-          <w:lang w:val="en-US"/>
-        </w:rPr>
-        <w:t>FilmShowing</w:t>
-      </w:r>
-      <w:proofErr w:type="spellEnd"/>
-      <w:r>
-        <w:rPr>
-          <w:lang w:val="en-US"/>
-        </w:rPr>
-        <w:t xml:space="preserve">, </w:t>
-      </w:r>
-      <w:proofErr w:type="spellStart"/>
-      <w:r>
-        <w:rPr>
-          <w:lang w:val="en-US"/>
-        </w:rPr>
-        <w:t>SpecialEvent</w:t>
-      </w:r>
-      <w:proofErr w:type="spellEnd"/>
+        <w:t>ConcreteObserver – FilmShowing, SpecialEvent</w:t>
+      </w:r>
       <w:r>
         <w:rPr>
           <w:lang w:val="en-US"/>
@@ -335,43 +238,8 @@
           <w:lang w:val="en-US"/>
         </w:rPr>
         <w:br/>
-      </w:r>
-      <w:proofErr w:type="spellStart"/>
-      <w:r>
-        <w:rPr>
-          <w:lang w:val="en-US"/>
-        </w:rPr>
-        <w:t>ConcreteSubject</w:t>
-      </w:r>
-      <w:proofErr w:type="spellEnd"/>
-      <w:r>
-        <w:rPr>
-          <w:lang w:val="en-US"/>
-        </w:rPr>
-        <w:t xml:space="preserve"> - </w:t>
-      </w:r>
-      <w:proofErr w:type="spellStart"/>
-      <w:r>
-        <w:rPr>
-          <w:lang w:val="en-US"/>
-        </w:rPr>
-        <w:t>FilmShowing</w:t>
-      </w:r>
-      <w:proofErr w:type="spellEnd"/>
-      <w:r>
-        <w:rPr>
-          <w:lang w:val="en-US"/>
-        </w:rPr>
-        <w:t xml:space="preserve">, </w:t>
-      </w:r>
-      <w:proofErr w:type="spellStart"/>
-      <w:r>
-        <w:rPr>
-          <w:lang w:val="en-US"/>
-        </w:rPr>
-        <w:t>SpecialEvent</w:t>
-      </w:r>
-      <w:proofErr w:type="spellEnd"/>
+        <w:t>ConcreteSubject - FilmShowing, SpecialEvent</w:t>
+      </w:r>
       <w:r>
         <w:rPr>
           <w:lang w:val="en-US"/>
@@ -396,21 +264,7 @@
           <w:lang w:val="en-US"/>
         </w:rPr>
         <w:br/>
-        <w:t xml:space="preserve">Event is a participant in both, because an Event can hold other Events (composite), and if an Event holding another </w:t>
-      </w:r>
-      <w:proofErr w:type="spellStart"/>
-      <w:r>
-        <w:rPr>
-          <w:lang w:val="en-US"/>
-        </w:rPr>
-        <w:t>Event</w:t>
-      </w:r>
-      <w:proofErr w:type="spellEnd"/>
-      <w:r>
-        <w:rPr>
-          <w:lang w:val="en-US"/>
-        </w:rPr>
-        <w:t xml:space="preserve"> gets cancelled (for example), then it has to notify its child Event to cancel it as well (Observer and Subject).</w:t>
+        <w:t>Event is a participant in both, because an Event can hold other Events (composite), and if an Event holding another Event gets cancelled (for example), then it has to notify its child Event to cancel it as well (Observer and Subject).</w:t>
       </w:r>
     </w:p>
     <w:p>
@@ -423,7 +277,61 @@
         <w:rPr>
           <w:lang w:val="en-US"/>
         </w:rPr>
+        <w:lastRenderedPageBreak/>
         <w:t>1.3)</w:t>
+      </w:r>
+      <w:r>
+        <w:rPr>
+          <w:lang w:val="en-US"/>
+        </w:rPr>
+        <w:t xml:space="preserve"> </w:t>
+      </w:r>
+      <w:r>
+        <w:rPr>
+          <w:noProof/>
+          <w:lang w:val="en-US"/>
+        </w:rPr>
+        <w:drawing>
+          <wp:inline distT="0" distB="0" distL="0" distR="0" wp14:anchorId="78C5BE79" wp14:editId="4E1C2592">
+            <wp:extent cx="5731510" cy="3014980"/>
+            <wp:effectExtent l="0" t="0" r="0" b="0"/>
+            <wp:docPr id="99929705" name="Picture 1"/>
+            <wp:cNvGraphicFramePr>
+              <a:graphicFrameLocks xmlns:a="http://schemas.openxmlformats.org/drawingml/2006/main" noChangeAspect="1"/>
+            </wp:cNvGraphicFramePr>
+            <a:graphic xmlns:a="http://schemas.openxmlformats.org/drawingml/2006/main">
+              <a:graphicData uri="http://schemas.openxmlformats.org/drawingml/2006/picture">
+                <pic:pic xmlns:pic="http://schemas.openxmlformats.org/drawingml/2006/picture">
+                  <pic:nvPicPr>
+                    <pic:cNvPr id="99929705" name="Picture 99929705"/>
+                    <pic:cNvPicPr/>
+                  </pic:nvPicPr>
+                  <pic:blipFill>
+                    <a:blip r:embed="rId5" cstate="print">
+                      <a:extLst>
+                        <a:ext uri="{28A0092B-C50C-407E-A947-70E740481C1C}">
+                          <a14:useLocalDpi xmlns:a14="http://schemas.microsoft.com/office/drawing/2010/main" val="0"/>
+                        </a:ext>
+                      </a:extLst>
+                    </a:blip>
+                    <a:stretch>
+                      <a:fillRect/>
+                    </a:stretch>
+                  </pic:blipFill>
+                  <pic:spPr>
+                    <a:xfrm>
+                      <a:off x="0" y="0"/>
+                      <a:ext cx="5731510" cy="3014980"/>
+                    </a:xfrm>
+                    <a:prstGeom prst="rect">
+                      <a:avLst/>
+                    </a:prstGeom>
+                  </pic:spPr>
+                </pic:pic>
+              </a:graphicData>
+            </a:graphic>
+          </wp:inline>
+        </w:drawing>
       </w:r>
     </w:p>
     <w:p>
@@ -480,55 +388,20 @@
         <w:rPr>
           <w:lang w:val="en-US"/>
         </w:rPr>
-        <w:t xml:space="preserve"> Hard-coded calls will not work as effectively because the client would need to keep track of which Events need to be </w:t>
-      </w:r>
-      <w:r>
-        <w:rPr>
-          <w:lang w:val="en-US"/>
-        </w:rPr>
-        <w:lastRenderedPageBreak/>
-        <w:t xml:space="preserve">notified after one </w:t>
-      </w:r>
-      <w:proofErr w:type="gramStart"/>
-      <w:r>
-        <w:rPr>
-          <w:lang w:val="en-US"/>
-        </w:rPr>
-        <w:t>changes</w:t>
-      </w:r>
-      <w:proofErr w:type="gramEnd"/>
-      <w:r>
-        <w:rPr>
-          <w:lang w:val="en-US"/>
-        </w:rPr>
-        <w:t>, which would become needlessly complicated and easily prone to error.</w:t>
-      </w:r>
-      <w:r>
-        <w:rPr>
-          <w:lang w:val="en-US"/>
-        </w:rPr>
-        <w:br/>
-      </w:r>
-      <w:r>
-        <w:rPr>
-          <w:lang w:val="en-US"/>
-        </w:rPr>
-        <w:br/>
-        <w:t xml:space="preserve">c) Event components are owned by the </w:t>
-      </w:r>
-      <w:proofErr w:type="spellStart"/>
-      <w:r>
-        <w:rPr>
-          <w:lang w:val="en-US"/>
-        </w:rPr>
-        <w:t>EventComponent</w:t>
-      </w:r>
-      <w:proofErr w:type="spellEnd"/>
-      <w:r>
-        <w:rPr>
-          <w:lang w:val="en-US"/>
-        </w:rPr>
-        <w:t>, which is owned by Event.</w:t>
+        <w:t xml:space="preserve"> Hard-coded calls will not work as effectively because the client would need to keep track of which Events need to be notified after one changes, which would become needlessly complicated and easily prone to error.</w:t>
+      </w:r>
+      <w:r>
+        <w:rPr>
+          <w:lang w:val="en-US"/>
+        </w:rPr>
+        <w:br/>
+      </w:r>
+      <w:r>
+        <w:rPr>
+          <w:lang w:val="en-US"/>
+        </w:rPr>
+        <w:br/>
+        <w:t>c) Event components are owned by the EventComponent, which is owned by Event.</w:t>
       </w:r>
       <w:r>
         <w:rPr>
@@ -547,21 +420,7 @@
         <w:rPr>
           <w:lang w:val="en-US"/>
         </w:rPr>
-        <w:t>The client (</w:t>
-      </w:r>
-      <w:proofErr w:type="spellStart"/>
-      <w:r>
-        <w:rPr>
-          <w:lang w:val="en-US"/>
-        </w:rPr>
-        <w:t>FilmFestival</w:t>
-      </w:r>
-      <w:proofErr w:type="spellEnd"/>
-      <w:r>
-        <w:rPr>
-          <w:lang w:val="en-US"/>
-        </w:rPr>
-        <w:t>) owns the Observer reference. The Observer/Subject itself owns a reference to Observer, because in our system the Observer and Subject are the same.</w:t>
+        <w:t>The client (FilmFestival) owns the Observer reference. The Observer/Subject itself owns a reference to Observer, because in our system the Observer and Subject are the same.</w:t>
       </w:r>
       <w:r>
         <w:rPr>
@@ -580,21 +439,7 @@
         <w:rPr>
           <w:lang w:val="en-US"/>
         </w:rPr>
-        <w:t xml:space="preserve"> If an </w:t>
-      </w:r>
-      <w:proofErr w:type="gramStart"/>
-      <w:r>
-        <w:rPr>
-          <w:lang w:val="en-US"/>
-        </w:rPr>
-        <w:t>Observer object updates</w:t>
-      </w:r>
-      <w:proofErr w:type="gramEnd"/>
-      <w:r>
-        <w:rPr>
-          <w:lang w:val="en-US"/>
-        </w:rPr>
-        <w:t xml:space="preserve"> based on another object in the same class, then it just means that the Observer and Subject belong to the same class.</w:t>
+        <w:t xml:space="preserve"> If an Observer object updates based on another object in the same class, then it just means that the Observer and Subject belong to the same class.</w:t>
       </w:r>
     </w:p>
     <w:p>
@@ -610,6 +455,80 @@
           <w:lang w:val="en-US"/>
         </w:rPr>
       </w:pPr>
+    </w:p>
+    <w:p>
+      <w:pPr>
+        <w:rPr>
+          <w:lang w:val="en-US"/>
+        </w:rPr>
+      </w:pPr>
+      <w:r>
+        <w:rPr>
+          <w:lang w:val="en-US"/>
+        </w:rPr>
+        <w:lastRenderedPageBreak/>
+        <w:t>2.3)</w:t>
+      </w:r>
+      <w:r>
+        <w:rPr>
+          <w:lang w:val="en-US"/>
+        </w:rPr>
+        <w:br/>
+      </w:r>
+      <w:r>
+        <w:rPr>
+          <w:noProof/>
+          <w:lang w:val="en-US"/>
+        </w:rPr>
+        <w:drawing>
+          <wp:inline distT="0" distB="0" distL="0" distR="0" wp14:anchorId="29E6DD1D" wp14:editId="31F766E9">
+            <wp:extent cx="5731510" cy="2990850"/>
+            <wp:effectExtent l="0" t="0" r="0" b="6350"/>
+            <wp:docPr id="61118424" name="Picture 2"/>
+            <wp:cNvGraphicFramePr>
+              <a:graphicFrameLocks xmlns:a="http://schemas.openxmlformats.org/drawingml/2006/main" noChangeAspect="1"/>
+            </wp:cNvGraphicFramePr>
+            <a:graphic xmlns:a="http://schemas.openxmlformats.org/drawingml/2006/main">
+              <a:graphicData uri="http://schemas.openxmlformats.org/drawingml/2006/picture">
+                <pic:pic xmlns:pic="http://schemas.openxmlformats.org/drawingml/2006/picture">
+                  <pic:nvPicPr>
+                    <pic:cNvPr id="61118424" name="Picture 61118424"/>
+                    <pic:cNvPicPr/>
+                  </pic:nvPicPr>
+                  <pic:blipFill>
+                    <a:blip r:embed="rId6">
+                      <a:extLst>
+                        <a:ext uri="{28A0092B-C50C-407E-A947-70E740481C1C}">
+                          <a14:useLocalDpi xmlns:a14="http://schemas.microsoft.com/office/drawing/2010/main" val="0"/>
+                        </a:ext>
+                      </a:extLst>
+                    </a:blip>
+                    <a:stretch>
+                      <a:fillRect/>
+                    </a:stretch>
+                  </pic:blipFill>
+                  <pic:spPr>
+                    <a:xfrm>
+                      <a:off x="0" y="0"/>
+                      <a:ext cx="5731510" cy="2990850"/>
+                    </a:xfrm>
+                    <a:prstGeom prst="rect">
+                      <a:avLst/>
+                    </a:prstGeom>
+                  </pic:spPr>
+                </pic:pic>
+              </a:graphicData>
+            </a:graphic>
+          </wp:inline>
+        </w:drawing>
+      </w:r>
+    </w:p>
+    <w:p>
+      <w:pPr>
+        <w:rPr>
+          <w:lang w:val="en-US"/>
+        </w:rPr>
+      </w:pPr>
       <w:r>
         <w:rPr>
           <w:lang w:val="en-US"/>
@@ -626,25 +545,27 @@
         <w:rPr>
           <w:lang w:val="en-US"/>
         </w:rPr>
-        <w:t xml:space="preserve">We chose </w:t>
-      </w:r>
-      <w:r>
-        <w:rPr>
-          <w:lang w:val="en-US"/>
-        </w:rPr>
-        <w:t>P</w:t>
-      </w:r>
-      <w:r>
-        <w:rPr>
-          <w:lang w:val="en-US"/>
-        </w:rPr>
-        <w:t xml:space="preserve">ull. The trade-off is that our Observers will only be notified that a change occurs, and it needs to query the Subject for that change. </w:t>
-      </w:r>
-      <w:r>
-        <w:rPr>
-          <w:lang w:val="en-US"/>
-        </w:rPr>
-        <w:t>Comparatively, with Push the Subject is the one who updates the Observer, however we decided against this as in our design, the Observer does not always need to be updated, hence by using Pull we allow the Observer to decide if it wants to update or not.</w:t>
+        <w:t>We chose the push approach for our Observer implementation. When the Subject changes its state, the Subject directly passes the relevant information to each registered Observer through update(NoticeType). The pushed information is the NoticeType, which Observers the respond to. We chose push because the Observers will always need to know what NoticeType was passed to the Subject, so it's not necessary to query the Subject to determine what changed. This makes the notification interaction straightforward and allows components to react immediately and differently to the same notice through polymorphism.</w:t>
+      </w:r>
+    </w:p>
+    <w:p>
+      <w:pPr>
+        <w:rPr>
+          <w:lang w:val="en-US"/>
+        </w:rPr>
+      </w:pPr>
+    </w:p>
+    <w:p>
+      <w:pPr>
+        <w:rPr>
+          <w:lang w:val="en-US"/>
+        </w:rPr>
+      </w:pPr>
+      <w:r>
+        <w:rPr>
+          <w:lang w:val="en-US"/>
+        </w:rPr>
+        <w:t>The trade-off is that the Subject must decide what information is relevant and include it in the notification. This can make the notification interface more tightly coupled to the information being communicated than the pull approach, where Observers query the Subject themselves.</w:t>
       </w:r>
     </w:p>
     <w:p>
@@ -682,91 +603,7 @@
         <w:rPr>
           <w:lang w:val="en-US"/>
         </w:rPr>
-        <w:t xml:space="preserve">Assume a </w:t>
-      </w:r>
-      <w:proofErr w:type="spellStart"/>
-      <w:r>
-        <w:rPr>
-          <w:lang w:val="en-US"/>
-        </w:rPr>
-        <w:t>FilmShowing</w:t>
-      </w:r>
-      <w:proofErr w:type="spellEnd"/>
-      <w:r>
-        <w:rPr>
-          <w:lang w:val="en-US"/>
-        </w:rPr>
-        <w:t xml:space="preserve"> Event has a </w:t>
-      </w:r>
-      <w:proofErr w:type="spellStart"/>
-      <w:r>
-        <w:rPr>
-          <w:lang w:val="en-US"/>
-        </w:rPr>
-        <w:t>DirectorPanel</w:t>
-      </w:r>
-      <w:proofErr w:type="spellEnd"/>
-      <w:r>
-        <w:rPr>
-          <w:lang w:val="en-US"/>
-        </w:rPr>
-        <w:t xml:space="preserve"> as a </w:t>
-      </w:r>
-      <w:proofErr w:type="spellStart"/>
-      <w:r>
-        <w:rPr>
-          <w:lang w:val="en-US"/>
-        </w:rPr>
-        <w:t>SpecialEvent</w:t>
-      </w:r>
-      <w:proofErr w:type="spellEnd"/>
-      <w:r>
-        <w:rPr>
-          <w:lang w:val="en-US"/>
-        </w:rPr>
-        <w:t xml:space="preserve">. If that </w:t>
-      </w:r>
-      <w:proofErr w:type="spellStart"/>
-      <w:r>
-        <w:rPr>
-          <w:lang w:val="en-US"/>
-        </w:rPr>
-        <w:t>FilmShowing</w:t>
-      </w:r>
-      <w:proofErr w:type="spellEnd"/>
-      <w:r>
-        <w:rPr>
-          <w:lang w:val="en-US"/>
-        </w:rPr>
-        <w:t xml:space="preserve"> is cancelled, the associated </w:t>
-      </w:r>
-      <w:proofErr w:type="spellStart"/>
-      <w:r>
-        <w:rPr>
-          <w:lang w:val="en-US"/>
-        </w:rPr>
-        <w:t>DirectorPanel</w:t>
-      </w:r>
-      <w:proofErr w:type="spellEnd"/>
-      <w:r>
-        <w:rPr>
-          <w:lang w:val="en-US"/>
-        </w:rPr>
-        <w:t xml:space="preserve"> should also be cancelled, however, every other </w:t>
-      </w:r>
-      <w:proofErr w:type="spellStart"/>
-      <w:r>
-        <w:rPr>
-          <w:lang w:val="en-US"/>
-        </w:rPr>
-        <w:t>FilmShowing</w:t>
-      </w:r>
-      <w:proofErr w:type="spellEnd"/>
-      <w:r>
-        <w:rPr>
-          <w:lang w:val="en-US"/>
-        </w:rPr>
-        <w:t xml:space="preserve"> should continue as normal.</w:t>
+        <w:t>Assume a FilmShowing Event has a DirectorPanel as a SpecialEvent. If that FilmShowing is cancelled, the associated DirectorPanel should also be cancelled, however, every other FilmShowing should continue as normal.</w:t>
       </w:r>
     </w:p>
     <w:p>
@@ -784,49 +621,7 @@
         <w:rPr>
           <w:lang w:val="en-US"/>
         </w:rPr>
-        <w:t xml:space="preserve">Suppose a mall is hosting a </w:t>
-      </w:r>
-      <w:proofErr w:type="spellStart"/>
-      <w:r>
-        <w:rPr>
-          <w:lang w:val="en-US"/>
-        </w:rPr>
-        <w:t>FilmFestivals</w:t>
-      </w:r>
-      <w:proofErr w:type="spellEnd"/>
-      <w:r>
-        <w:rPr>
-          <w:lang w:val="en-US"/>
-        </w:rPr>
-        <w:t xml:space="preserve"> but is showing it at two locations at once, one in a cinema and one outdoors in the parking lot (both inside the mall’s property). If a </w:t>
-      </w:r>
-      <w:proofErr w:type="spellStart"/>
-      <w:r>
-        <w:rPr>
-          <w:lang w:val="en-US"/>
-        </w:rPr>
-        <w:t>WeatherAlert</w:t>
-      </w:r>
-      <w:proofErr w:type="spellEnd"/>
-      <w:r>
-        <w:rPr>
-          <w:lang w:val="en-US"/>
-        </w:rPr>
-        <w:t xml:space="preserve"> occurs due to bad weather, the </w:t>
-      </w:r>
-      <w:proofErr w:type="spellStart"/>
-      <w:r>
-        <w:rPr>
-          <w:lang w:val="en-US"/>
-        </w:rPr>
-        <w:t>OutdoorVenue</w:t>
-      </w:r>
-      <w:proofErr w:type="spellEnd"/>
-      <w:r>
-        <w:rPr>
-          <w:lang w:val="en-US"/>
-        </w:rPr>
-        <w:t xml:space="preserve"> should be notified such that </w:t>
+        <w:t xml:space="preserve">Suppose a mall is hosting a FilmFestivals but is showing it at two locations at once, one in a cinema and one outdoors in the parking lot (both inside the mall’s property). If a WeatherAlert occurs due to bad weather, the OutdoorVenue should be notified such that </w:t>
       </w:r>
       <w:r>
         <w:rPr>
@@ -862,27 +657,20 @@
         <w:rPr>
           <w:lang w:val="en-US"/>
         </w:rPr>
-        <w:t xml:space="preserve">be relocated to the Cinema; the </w:t>
-      </w:r>
-      <w:r>
-        <w:rPr>
-          <w:lang w:val="en-US"/>
-        </w:rPr>
-        <w:t xml:space="preserve">Cinema should not close, however it should be aware of the new people coming in and send a </w:t>
-      </w:r>
-      <w:proofErr w:type="spellStart"/>
-      <w:r>
-        <w:rPr>
-          <w:lang w:val="en-US"/>
-        </w:rPr>
-        <w:t>CapacityAlert</w:t>
-      </w:r>
-      <w:proofErr w:type="spellEnd"/>
-      <w:r>
-        <w:rPr>
-          <w:lang w:val="en-US"/>
-        </w:rPr>
-        <w:t xml:space="preserve"> if there is not enough space.</w:t>
+        <w:t xml:space="preserve">be relocated </w:t>
+      </w:r>
+      <w:r>
+        <w:rPr>
+          <w:lang w:val="en-US"/>
+        </w:rPr>
+        <w:lastRenderedPageBreak/>
+        <w:t xml:space="preserve">to the Cinema; the </w:t>
+      </w:r>
+      <w:r>
+        <w:rPr>
+          <w:lang w:val="en-US"/>
+        </w:rPr>
+        <w:t>Cinema should not close, however it should be aware of the new people coming in and send a CapacityAlert if there is not enough space.</w:t>
       </w:r>
     </w:p>
     <w:p>
@@ -900,34 +688,13 @@
         <w:rPr>
           <w:lang w:val="en-US"/>
         </w:rPr>
-        <w:t xml:space="preserve">When a </w:t>
-      </w:r>
-      <w:proofErr w:type="spellStart"/>
-      <w:r>
-        <w:rPr>
-          <w:lang w:val="en-US"/>
-        </w:rPr>
-        <w:t>FilmFestival</w:t>
-      </w:r>
-      <w:proofErr w:type="spellEnd"/>
-      <w:r>
-        <w:rPr>
-          <w:lang w:val="en-US"/>
-        </w:rPr>
-        <w:t xml:space="preserve"> </w:t>
-      </w:r>
-      <w:r>
-        <w:rPr>
-          <w:lang w:val="en-US"/>
-        </w:rPr>
-        <w:t xml:space="preserve">inside of an </w:t>
-      </w:r>
-      <w:proofErr w:type="gramStart"/>
-      <w:r>
-        <w:rPr>
-          <w:lang w:val="en-US"/>
-        </w:rPr>
-        <w:t xml:space="preserve">independent building </w:t>
+        <w:t xml:space="preserve">When a FilmFestival </w:t>
+      </w:r>
+      <w:r>
+        <w:rPr>
+          <w:lang w:val="en-US"/>
+        </w:rPr>
+        <w:t xml:space="preserve">inside of an independent building </w:t>
       </w:r>
       <w:r>
         <w:rPr>
@@ -945,84 +712,7 @@
         <w:rPr>
           <w:lang w:val="en-US"/>
         </w:rPr>
-        <w:t>finishes</w:t>
-      </w:r>
-      <w:proofErr w:type="gramEnd"/>
-      <w:r>
-        <w:rPr>
-          <w:lang w:val="en-US"/>
-        </w:rPr>
-        <w:t xml:space="preserve">, then the venues should remain open in case other movies are playing (unrelated to the festival), the </w:t>
-      </w:r>
-      <w:proofErr w:type="spellStart"/>
-      <w:r>
-        <w:rPr>
-          <w:lang w:val="en-US"/>
-        </w:rPr>
-        <w:t>TicketDesk</w:t>
-      </w:r>
-      <w:proofErr w:type="spellEnd"/>
-      <w:r>
-        <w:rPr>
-          <w:lang w:val="en-US"/>
-        </w:rPr>
-        <w:t xml:space="preserve">, </w:t>
-      </w:r>
-      <w:proofErr w:type="spellStart"/>
-      <w:r>
-        <w:rPr>
-          <w:lang w:val="en-US"/>
-        </w:rPr>
-        <w:t>InformationDesk</w:t>
-      </w:r>
-      <w:proofErr w:type="spellEnd"/>
-      <w:r>
-        <w:rPr>
-          <w:lang w:val="en-US"/>
-        </w:rPr>
-        <w:t xml:space="preserve">, </w:t>
-      </w:r>
-      <w:proofErr w:type="spellStart"/>
-      <w:r>
-        <w:rPr>
-          <w:lang w:val="en-US"/>
-        </w:rPr>
-        <w:t>FoodArea</w:t>
-      </w:r>
-      <w:proofErr w:type="spellEnd"/>
-      <w:r>
-        <w:rPr>
-          <w:lang w:val="en-US"/>
-        </w:rPr>
-        <w:t xml:space="preserve"> and </w:t>
-      </w:r>
-      <w:proofErr w:type="spellStart"/>
-      <w:r>
-        <w:rPr>
-          <w:lang w:val="en-US"/>
-        </w:rPr>
-        <w:t>ScreeningArea</w:t>
-      </w:r>
-      <w:proofErr w:type="spellEnd"/>
-      <w:r>
-        <w:rPr>
-          <w:lang w:val="en-US"/>
-        </w:rPr>
-        <w:t xml:space="preserve"> remain open, however the </w:t>
-      </w:r>
-      <w:proofErr w:type="spellStart"/>
-      <w:r>
-        <w:rPr>
-          <w:lang w:val="en-US"/>
-        </w:rPr>
-        <w:t>SpecialEventArea</w:t>
-      </w:r>
-      <w:proofErr w:type="spellEnd"/>
-      <w:r>
-        <w:rPr>
-          <w:lang w:val="en-US"/>
-        </w:rPr>
-        <w:t xml:space="preserve"> closes.</w:t>
+        <w:t>finishes, then the venues should remain open in case other movies are playing (unrelated to the festival), the TicketDesk, InformationDesk, FoodArea and ScreeningArea remain open, however the SpecialEventArea closes.</w:t>
       </w:r>
     </w:p>
     <w:p>
@@ -1040,126 +730,7 @@
         <w:rPr>
           <w:lang w:val="en-US"/>
         </w:rPr>
-        <w:t xml:space="preserve">If the </w:t>
-      </w:r>
-      <w:proofErr w:type="spellStart"/>
-      <w:r>
-        <w:rPr>
-          <w:lang w:val="en-US"/>
-        </w:rPr>
-        <w:t>FilmFestival</w:t>
-      </w:r>
-      <w:proofErr w:type="spellEnd"/>
-      <w:r>
-        <w:rPr>
-          <w:lang w:val="en-US"/>
-        </w:rPr>
-        <w:t xml:space="preserve"> is held inside a building used exclusively for Film Festivals, then if there is no active </w:t>
-      </w:r>
-      <w:proofErr w:type="spellStart"/>
-      <w:r>
-        <w:rPr>
-          <w:lang w:val="en-US"/>
-        </w:rPr>
-        <w:t>FilmShowing</w:t>
-      </w:r>
-      <w:proofErr w:type="spellEnd"/>
-      <w:r>
-        <w:rPr>
-          <w:lang w:val="en-US"/>
-        </w:rPr>
-        <w:t xml:space="preserve"> or </w:t>
-      </w:r>
-      <w:proofErr w:type="spellStart"/>
-      <w:r>
-        <w:rPr>
-          <w:lang w:val="en-US"/>
-        </w:rPr>
-        <w:t>SpecialEvent</w:t>
-      </w:r>
-      <w:proofErr w:type="spellEnd"/>
-      <w:r>
-        <w:rPr>
-          <w:lang w:val="en-US"/>
-        </w:rPr>
-        <w:t xml:space="preserve"> happening, the </w:t>
-      </w:r>
-      <w:proofErr w:type="spellStart"/>
-      <w:r>
-        <w:rPr>
-          <w:lang w:val="en-US"/>
-        </w:rPr>
-        <w:t>ScreeningArea</w:t>
-      </w:r>
-      <w:proofErr w:type="spellEnd"/>
-      <w:r>
-        <w:rPr>
-          <w:lang w:val="en-US"/>
-        </w:rPr>
-        <w:t xml:space="preserve">, </w:t>
-      </w:r>
-      <w:proofErr w:type="spellStart"/>
-      <w:r>
-        <w:rPr>
-          <w:lang w:val="en-US"/>
-        </w:rPr>
-        <w:t>SpecialEventArea</w:t>
-      </w:r>
-      <w:proofErr w:type="spellEnd"/>
-      <w:r>
-        <w:rPr>
-          <w:lang w:val="en-US"/>
-        </w:rPr>
-        <w:t xml:space="preserve"> and </w:t>
-      </w:r>
-      <w:proofErr w:type="spellStart"/>
-      <w:r>
-        <w:rPr>
-          <w:lang w:val="en-US"/>
-        </w:rPr>
-        <w:t>TicketDesk</w:t>
-      </w:r>
-      <w:proofErr w:type="spellEnd"/>
-      <w:r>
-        <w:rPr>
-          <w:lang w:val="en-US"/>
-        </w:rPr>
-        <w:t xml:space="preserve"> should not be open. The </w:t>
-      </w:r>
-      <w:proofErr w:type="spellStart"/>
-      <w:r>
-        <w:rPr>
-          <w:lang w:val="en-US"/>
-        </w:rPr>
-        <w:t>InformationDesk</w:t>
-      </w:r>
-      <w:proofErr w:type="spellEnd"/>
-      <w:r>
-        <w:rPr>
-          <w:lang w:val="en-US"/>
-        </w:rPr>
-        <w:t xml:space="preserve"> and </w:t>
-      </w:r>
-      <w:proofErr w:type="spellStart"/>
-      <w:r>
-        <w:rPr>
-          <w:lang w:val="en-US"/>
-        </w:rPr>
-        <w:t>FoodArea</w:t>
-      </w:r>
-      <w:proofErr w:type="spellEnd"/>
-      <w:r>
-        <w:rPr>
-          <w:lang w:val="en-US"/>
-        </w:rPr>
-        <w:t xml:space="preserve"> may still be open, for if information about a </w:t>
-      </w:r>
-      <w:r>
-        <w:rPr>
-          <w:lang w:val="en-US"/>
-        </w:rPr>
-        <w:lastRenderedPageBreak/>
-        <w:t>previous/future festival needs to be acquired, or if someone wishes to purchase food.</w:t>
+        <w:t>If the FilmFestival is held inside a building used exclusively for Film Festivals, then if there is no active FilmShowing or SpecialEvent happening, the ScreeningArea, SpecialEventArea and TicketDesk should not be open. The InformationDesk and FoodArea may still be open, for if information about a previous/future festival needs to be acquired, or if someone wishes to purchase food.</w:t>
       </w:r>
     </w:p>
     <w:p>
@@ -1177,139 +748,13 @@
         <w:rPr>
           <w:lang w:val="en-US"/>
         </w:rPr>
-        <w:t xml:space="preserve">If a </w:t>
-      </w:r>
-      <w:proofErr w:type="spellStart"/>
-      <w:r>
-        <w:rPr>
-          <w:lang w:val="en-US"/>
-        </w:rPr>
-        <w:t>FilmShowing</w:t>
-      </w:r>
-      <w:proofErr w:type="spellEnd"/>
-      <w:r>
-        <w:rPr>
-          <w:lang w:val="en-US"/>
-        </w:rPr>
-        <w:t xml:space="preserve"> becomes Paused, then </w:t>
-      </w:r>
-      <w:r>
-        <w:rPr>
-          <w:lang w:val="en-US"/>
-        </w:rPr>
-        <w:t xml:space="preserve">the </w:t>
-      </w:r>
-      <w:proofErr w:type="spellStart"/>
-      <w:r>
-        <w:rPr>
-          <w:lang w:val="en-US"/>
-        </w:rPr>
-        <w:t>ScreeningArea</w:t>
-      </w:r>
-      <w:proofErr w:type="spellEnd"/>
-      <w:r>
-        <w:rPr>
-          <w:lang w:val="en-US"/>
-        </w:rPr>
-        <w:t xml:space="preserve"> should pause and only resume when the </w:t>
-      </w:r>
-      <w:proofErr w:type="spellStart"/>
-      <w:r>
-        <w:rPr>
-          <w:lang w:val="en-US"/>
-        </w:rPr>
-        <w:t>FilmShowing</w:t>
-      </w:r>
-      <w:proofErr w:type="spellEnd"/>
-      <w:r>
-        <w:rPr>
-          <w:lang w:val="en-US"/>
-        </w:rPr>
-        <w:t xml:space="preserve"> resumes. The </w:t>
-      </w:r>
-      <w:proofErr w:type="spellStart"/>
-      <w:r>
-        <w:rPr>
-          <w:lang w:val="en-US"/>
-        </w:rPr>
-        <w:t>TicketDesk</w:t>
-      </w:r>
-      <w:proofErr w:type="spellEnd"/>
-      <w:r>
-        <w:rPr>
-          <w:lang w:val="en-US"/>
-        </w:rPr>
-        <w:t xml:space="preserve">, </w:t>
-      </w:r>
-      <w:proofErr w:type="spellStart"/>
-      <w:r>
-        <w:rPr>
-          <w:lang w:val="en-US"/>
-        </w:rPr>
-        <w:t>InformationDesk</w:t>
-      </w:r>
-      <w:proofErr w:type="spellEnd"/>
-      <w:r>
-        <w:rPr>
-          <w:lang w:val="en-US"/>
-        </w:rPr>
-        <w:t xml:space="preserve"> and </w:t>
-      </w:r>
-      <w:proofErr w:type="spellStart"/>
-      <w:r>
-        <w:rPr>
-          <w:lang w:val="en-US"/>
-        </w:rPr>
-        <w:t>FoodArea</w:t>
-      </w:r>
-      <w:proofErr w:type="spellEnd"/>
-      <w:r>
-        <w:rPr>
-          <w:lang w:val="en-US"/>
-        </w:rPr>
-        <w:t xml:space="preserve"> remain open and active while this happens. The </w:t>
-      </w:r>
-      <w:proofErr w:type="spellStart"/>
-      <w:r>
-        <w:rPr>
-          <w:lang w:val="en-US"/>
-        </w:rPr>
-        <w:t>SpecialEventArea</w:t>
-      </w:r>
-      <w:proofErr w:type="spellEnd"/>
-      <w:r>
-        <w:rPr>
-          <w:lang w:val="en-US"/>
-        </w:rPr>
-        <w:t xml:space="preserve"> may need a </w:t>
-      </w:r>
-      <w:proofErr w:type="spellStart"/>
-      <w:r>
-        <w:rPr>
-          <w:lang w:val="en-US"/>
-        </w:rPr>
-        <w:t>ScheduleChange</w:t>
-      </w:r>
-      <w:proofErr w:type="spellEnd"/>
-      <w:r>
-        <w:rPr>
-          <w:lang w:val="en-US"/>
-        </w:rPr>
-        <w:t xml:space="preserve"> when this happens, depending on how long the </w:t>
-      </w:r>
-      <w:proofErr w:type="spellStart"/>
-      <w:r>
-        <w:rPr>
-          <w:lang w:val="en-US"/>
-        </w:rPr>
-        <w:t>FilmShowing</w:t>
-      </w:r>
-      <w:proofErr w:type="spellEnd"/>
-      <w:r>
-        <w:rPr>
-          <w:lang w:val="en-US"/>
-        </w:rPr>
-        <w:t xml:space="preserve"> is paused for.</w:t>
+        <w:t xml:space="preserve">If a FilmShowing becomes Paused, then </w:t>
+      </w:r>
+      <w:r>
+        <w:rPr>
+          <w:lang w:val="en-US"/>
+        </w:rPr>
+        <w:t>the ScreeningArea should pause and only resume when the FilmShowing resumes. The TicketDesk, InformationDesk and FoodArea remain open and active while this happens. The SpecialEventArea may need a ScheduleChange when this happens, depending on how long the FilmShowing is paused for.</w:t>
       </w:r>
     </w:p>
     <w:p>
@@ -1327,29 +772,374 @@
     </w:p>
     <w:p>
       <w:pPr>
-        <w:rPr>
-          <w:lang w:val="en-US"/>
-        </w:rPr>
-      </w:pPr>
+        <w:pStyle w:val="ListParagraph"/>
+        <w:numPr>
+          <w:ilvl w:val="0"/>
+          <w:numId w:val="2"/>
+        </w:numPr>
+        <w:rPr>
+          <w:lang w:val="en-US"/>
+        </w:rPr>
+      </w:pPr>
+      <w:r>
+        <w:rPr>
+          <w:lang w:val="en-US"/>
+        </w:rPr>
+        <w:t xml:space="preserve">Our Observer/Subject is also a Composite. </w:t>
+      </w:r>
+      <w:r>
+        <w:rPr>
+          <w:lang w:val="en-US"/>
+        </w:rPr>
+        <w:t>This was necessary because an Event can contain other Events</w:t>
+      </w:r>
+      <w:r>
+        <w:rPr>
+          <w:lang w:val="en-US"/>
+        </w:rPr>
+        <w:t>.</w:t>
+      </w:r>
     </w:p>
     <w:p>
       <w:pPr>
+        <w:pStyle w:val="ListParagraph"/>
+        <w:numPr>
+          <w:ilvl w:val="0"/>
+          <w:numId w:val="2"/>
+        </w:numPr>
+        <w:rPr>
+          <w:lang w:val="en-US"/>
+        </w:rPr>
+      </w:pPr>
+      <w:r>
+        <w:rPr>
+          <w:lang w:val="en-US"/>
+        </w:rPr>
+        <w:t xml:space="preserve">Our Observer is also our Subject. This was necessary because an update to </w:t>
+      </w:r>
+      <w:r>
+        <w:rPr>
+          <w:lang w:val="en-US"/>
+        </w:rPr>
+        <w:t>a</w:t>
+      </w:r>
+      <w:r>
+        <w:rPr>
+          <w:lang w:val="en-US"/>
+        </w:rPr>
+        <w:t xml:space="preserve"> parent  Event should update the children.</w:t>
+      </w:r>
+    </w:p>
+    <w:p>
+      <w:pPr>
+        <w:pStyle w:val="ListParagraph"/>
+        <w:numPr>
+          <w:ilvl w:val="0"/>
+          <w:numId w:val="2"/>
+        </w:numPr>
+        <w:rPr>
+          <w:lang w:val="en-US"/>
+        </w:rPr>
+      </w:pPr>
+      <w:r>
+        <w:rPr>
+          <w:lang w:val="en-US"/>
+        </w:rPr>
+        <w:t>We added Enumeration classes to various classes</w:t>
+      </w:r>
+      <w:r>
+        <w:rPr>
+          <w:lang w:val="en-US"/>
+        </w:rPr>
+        <w:t>, which makes our design more compact, streamlined and efficient.</w:t>
+      </w:r>
+      <w:r>
+        <w:rPr>
+          <w:lang w:val="en-US"/>
+        </w:rPr>
+        <w:t xml:space="preserve"> This eliminates human error.</w:t>
+      </w:r>
+    </w:p>
+    <w:p>
+      <w:pPr>
+        <w:rPr>
+          <w:lang w:val="en-US"/>
+        </w:rPr>
+      </w:pPr>
+      <w:r>
+        <w:rPr>
+          <w:lang w:val="en-US"/>
+        </w:rPr>
+        <w:t>5.1)</w:t>
+      </w:r>
+      <w:r>
+        <w:rPr>
+          <w:lang w:val="en-US"/>
+        </w:rPr>
+        <w:br/>
+      </w:r>
+      <w:r>
+        <w:rPr>
+          <w:noProof/>
+          <w:lang w:val="en-US"/>
+        </w:rPr>
+        <w:drawing>
+          <wp:inline distT="0" distB="0" distL="0" distR="0" wp14:anchorId="258B294C" wp14:editId="7A5EC513">
+            <wp:extent cx="5731510" cy="2023110"/>
+            <wp:effectExtent l="0" t="0" r="0" b="0"/>
+            <wp:docPr id="1267718575" name="Picture 3"/>
+            <wp:cNvGraphicFramePr>
+              <a:graphicFrameLocks xmlns:a="http://schemas.openxmlformats.org/drawingml/2006/main" noChangeAspect="1"/>
+            </wp:cNvGraphicFramePr>
+            <a:graphic xmlns:a="http://schemas.openxmlformats.org/drawingml/2006/main">
+              <a:graphicData uri="http://schemas.openxmlformats.org/drawingml/2006/picture">
+                <pic:pic xmlns:pic="http://schemas.openxmlformats.org/drawingml/2006/picture">
+                  <pic:nvPicPr>
+                    <pic:cNvPr id="1267718575" name="Picture 1267718575"/>
+                    <pic:cNvPicPr/>
+                  </pic:nvPicPr>
+                  <pic:blipFill>
+                    <a:blip r:embed="rId7" cstate="print">
+                      <a:extLst>
+                        <a:ext uri="{28A0092B-C50C-407E-A947-70E740481C1C}">
+                          <a14:useLocalDpi xmlns:a14="http://schemas.microsoft.com/office/drawing/2010/main" val="0"/>
+                        </a:ext>
+                      </a:extLst>
+                    </a:blip>
+                    <a:stretch>
+                      <a:fillRect/>
+                    </a:stretch>
+                  </pic:blipFill>
+                  <pic:spPr>
+                    <a:xfrm>
+                      <a:off x="0" y="0"/>
+                      <a:ext cx="5731510" cy="2023110"/>
+                    </a:xfrm>
+                    <a:prstGeom prst="rect">
+                      <a:avLst/>
+                    </a:prstGeom>
+                  </pic:spPr>
+                </pic:pic>
+              </a:graphicData>
+            </a:graphic>
+          </wp:inline>
+        </w:drawing>
+      </w:r>
+    </w:p>
+    <w:p>
+      <w:pPr>
         <w:rPr>
           <w:b/>
           <w:bCs/>
           <w:lang w:val="en-US"/>
         </w:rPr>
       </w:pPr>
-      <w:proofErr w:type="spellStart"/>
+      <w:r>
+        <w:rPr>
+          <w:lang w:val="en-US"/>
+        </w:rPr>
+        <w:lastRenderedPageBreak/>
+        <w:t>5.2)</w:t>
+      </w:r>
+      <w:r>
+        <w:rPr>
+          <w:lang w:val="en-US"/>
+        </w:rPr>
+        <w:br/>
+      </w:r>
+      <w:r>
+        <w:rPr>
+          <w:noProof/>
+          <w:lang w:val="en-US"/>
+        </w:rPr>
+        <w:drawing>
+          <wp:inline distT="0" distB="0" distL="0" distR="0" wp14:anchorId="5476242A" wp14:editId="448782C0">
+            <wp:extent cx="5731510" cy="2684145"/>
+            <wp:effectExtent l="0" t="0" r="0" b="0"/>
+            <wp:docPr id="2096665531" name="Picture 4"/>
+            <wp:cNvGraphicFramePr>
+              <a:graphicFrameLocks xmlns:a="http://schemas.openxmlformats.org/drawingml/2006/main" noChangeAspect="1"/>
+            </wp:cNvGraphicFramePr>
+            <a:graphic xmlns:a="http://schemas.openxmlformats.org/drawingml/2006/main">
+              <a:graphicData uri="http://schemas.openxmlformats.org/drawingml/2006/picture">
+                <pic:pic xmlns:pic="http://schemas.openxmlformats.org/drawingml/2006/picture">
+                  <pic:nvPicPr>
+                    <pic:cNvPr id="2096665531" name="Picture 2096665531"/>
+                    <pic:cNvPicPr/>
+                  </pic:nvPicPr>
+                  <pic:blipFill>
+                    <a:blip r:embed="rId8">
+                      <a:extLst>
+                        <a:ext uri="{28A0092B-C50C-407E-A947-70E740481C1C}">
+                          <a14:useLocalDpi xmlns:a14="http://schemas.microsoft.com/office/drawing/2010/main" val="0"/>
+                        </a:ext>
+                      </a:extLst>
+                    </a:blip>
+                    <a:stretch>
+                      <a:fillRect/>
+                    </a:stretch>
+                  </pic:blipFill>
+                  <pic:spPr>
+                    <a:xfrm>
+                      <a:off x="0" y="0"/>
+                      <a:ext cx="5731510" cy="2684145"/>
+                    </a:xfrm>
+                    <a:prstGeom prst="rect">
+                      <a:avLst/>
+                    </a:prstGeom>
+                  </pic:spPr>
+                </pic:pic>
+              </a:graphicData>
+            </a:graphic>
+          </wp:inline>
+        </w:drawing>
+      </w:r>
+      <w:r>
+        <w:rPr>
+          <w:lang w:val="en-US"/>
+        </w:rPr>
+        <w:br/>
+        <w:t>5.3</w:t>
+      </w:r>
+      <w:r>
+        <w:rPr>
+          <w:lang w:val="en-US"/>
+        </w:rPr>
+        <w:t>)</w:t>
+      </w:r>
+      <w:r>
+        <w:rPr>
+          <w:lang w:val="en-US"/>
+        </w:rPr>
+        <w:br/>
+      </w:r>
+      <w:r>
+        <w:rPr>
+          <w:noProof/>
+          <w:lang w:val="en-US"/>
+        </w:rPr>
+        <w:lastRenderedPageBreak/>
+        <w:drawing>
+          <wp:inline distT="0" distB="0" distL="0" distR="0" wp14:anchorId="515DE7A1" wp14:editId="38C898A4">
+            <wp:extent cx="5731510" cy="6525895"/>
+            <wp:effectExtent l="0" t="0" r="0" b="1905"/>
+            <wp:docPr id="1120505353" name="Picture 5"/>
+            <wp:cNvGraphicFramePr>
+              <a:graphicFrameLocks xmlns:a="http://schemas.openxmlformats.org/drawingml/2006/main" noChangeAspect="1"/>
+            </wp:cNvGraphicFramePr>
+            <a:graphic xmlns:a="http://schemas.openxmlformats.org/drawingml/2006/main">
+              <a:graphicData uri="http://schemas.openxmlformats.org/drawingml/2006/picture">
+                <pic:pic xmlns:pic="http://schemas.openxmlformats.org/drawingml/2006/picture">
+                  <pic:nvPicPr>
+                    <pic:cNvPr id="1120505353" name="Picture 1120505353"/>
+                    <pic:cNvPicPr/>
+                  </pic:nvPicPr>
+                  <pic:blipFill>
+                    <a:blip r:embed="rId9">
+                      <a:extLst>
+                        <a:ext uri="{28A0092B-C50C-407E-A947-70E740481C1C}">
+                          <a14:useLocalDpi xmlns:a14="http://schemas.microsoft.com/office/drawing/2010/main" val="0"/>
+                        </a:ext>
+                      </a:extLst>
+                    </a:blip>
+                    <a:stretch>
+                      <a:fillRect/>
+                    </a:stretch>
+                  </pic:blipFill>
+                  <pic:spPr>
+                    <a:xfrm>
+                      <a:off x="0" y="0"/>
+                      <a:ext cx="5731510" cy="6525895"/>
+                    </a:xfrm>
+                    <a:prstGeom prst="rect">
+                      <a:avLst/>
+                    </a:prstGeom>
+                  </pic:spPr>
+                </pic:pic>
+              </a:graphicData>
+            </a:graphic>
+          </wp:inline>
+        </w:drawing>
+      </w:r>
+      <w:r>
+        <w:rPr>
+          <w:lang w:val="en-US"/>
+        </w:rPr>
+        <w:br/>
+        <w:t>5.4)</w:t>
+      </w:r>
+      <w:r>
+        <w:rPr>
+          <w:lang w:val="en-US"/>
+        </w:rPr>
+        <w:br/>
+      </w:r>
       <w:r>
         <w:rPr>
           <w:b/>
           <w:bCs/>
+          <w:noProof/>
+          <w:lang w:val="en-US"/>
+        </w:rPr>
+        <w:lastRenderedPageBreak/>
+        <w:drawing>
+          <wp:inline distT="0" distB="0" distL="0" distR="0" wp14:anchorId="0F101356" wp14:editId="546323BC">
+            <wp:extent cx="5731510" cy="4006850"/>
+            <wp:effectExtent l="0" t="0" r="0" b="6350"/>
+            <wp:docPr id="1106204982" name="Picture 6"/>
+            <wp:cNvGraphicFramePr>
+              <a:graphicFrameLocks xmlns:a="http://schemas.openxmlformats.org/drawingml/2006/main" noChangeAspect="1"/>
+            </wp:cNvGraphicFramePr>
+            <a:graphic xmlns:a="http://schemas.openxmlformats.org/drawingml/2006/main">
+              <a:graphicData uri="http://schemas.openxmlformats.org/drawingml/2006/picture">
+                <pic:pic xmlns:pic="http://schemas.openxmlformats.org/drawingml/2006/picture">
+                  <pic:nvPicPr>
+                    <pic:cNvPr id="1106204982" name="Picture 1106204982"/>
+                    <pic:cNvPicPr/>
+                  </pic:nvPicPr>
+                  <pic:blipFill>
+                    <a:blip r:embed="rId10" cstate="print">
+                      <a:extLst>
+                        <a:ext uri="{28A0092B-C50C-407E-A947-70E740481C1C}">
+                          <a14:useLocalDpi xmlns:a14="http://schemas.microsoft.com/office/drawing/2010/main" val="0"/>
+                        </a:ext>
+                      </a:extLst>
+                    </a:blip>
+                    <a:stretch>
+                      <a:fillRect/>
+                    </a:stretch>
+                  </pic:blipFill>
+                  <pic:spPr>
+                    <a:xfrm>
+                      <a:off x="0" y="0"/>
+                      <a:ext cx="5731510" cy="4006850"/>
+                    </a:xfrm>
+                    <a:prstGeom prst="rect">
+                      <a:avLst/>
+                    </a:prstGeom>
+                  </pic:spPr>
+                </pic:pic>
+              </a:graphicData>
+            </a:graphic>
+          </wp:inline>
+        </w:drawing>
+      </w:r>
+      <w:r>
+        <w:rPr>
+          <w:b/>
+          <w:bCs/>
+          <w:lang w:val="en-US"/>
+        </w:rPr>
+        <w:br/>
+      </w:r>
+      <w:r>
+        <w:rPr>
+          <w:b/>
+          <w:bCs/>
           <w:lang w:val="en-US"/>
         </w:rPr>
         <w:t>Doxygen</w:t>
       </w:r>
-      <w:proofErr w:type="spellEnd"/>
     </w:p>
     <w:p>
       <w:pPr>
@@ -1363,7 +1153,7 @@
           <w:lang w:val="en-US"/>
         </w:rPr>
         <w:drawing>
-          <wp:inline distT="0" distB="0" distL="0" distR="0" wp14:anchorId="2D50C41F" wp14:editId="63D0AE7C">
+          <wp:inline distT="0" distB="0" distL="0" distR="0" wp14:anchorId="2D50C41F" wp14:editId="1982E872">
             <wp:extent cx="5731510" cy="2543175"/>
             <wp:effectExtent l="0" t="0" r="0" b="0"/>
             <wp:docPr id="421030069" name="Picture 4"/>
@@ -1378,7 +1168,7 @@
                     <pic:cNvPicPr/>
                   </pic:nvPicPr>
                   <pic:blipFill>
-                    <a:blip r:embed="rId5" cstate="print">
+                    <a:blip r:embed="rId11" cstate="print">
                       <a:extLst>
                         <a:ext uri="{28A0092B-C50C-407E-A947-70E740481C1C}">
                           <a14:useLocalDpi xmlns:a14="http://schemas.microsoft.com/office/drawing/2010/main" val="0"/>
@@ -1418,7 +1208,6 @@
           <w:lang w:val="en-US"/>
         </w:rPr>
       </w:pPr>
-      <w:proofErr w:type="spellStart"/>
       <w:r>
         <w:rPr>
           <w:b/>
@@ -1427,7 +1216,6 @@
         </w:rPr>
         <w:t>Github</w:t>
       </w:r>
-      <w:proofErr w:type="spellEnd"/>
       <w:r>
         <w:rPr>
           <w:b/>
@@ -1460,27 +1248,14 @@
         </w:rPr>
         <w:t xml:space="preserve">7.4) The work was essentially divided into coding and designing, with the designing taking two people. </w:t>
       </w:r>
-      <w:proofErr w:type="spellStart"/>
-      <w:r>
-        <w:t>Simnikiwe</w:t>
-      </w:r>
-      <w:proofErr w:type="spellEnd"/>
-      <w:r>
-        <w:t xml:space="preserve"> </w:t>
-      </w:r>
-      <w:r>
-        <w:t xml:space="preserve">and Junayd were in charge of the system design and diagrams, and Conrad was in charge of the coding/implementation and </w:t>
-      </w:r>
-      <w:proofErr w:type="spellStart"/>
-      <w:r>
-        <w:t>Doxygen</w:t>
-      </w:r>
-      <w:proofErr w:type="spellEnd"/>
-      <w:r>
-        <w:t xml:space="preserve">. All members, however, had a say in each aspect of the practical. </w:t>
-      </w:r>
-      <w:r>
-        <w:br/>
+      <w:r>
+        <w:t xml:space="preserve">Simnikiwe and Junayd were in charge of the system design and diagrams, and Conrad was in charge of the coding/implementation and Doxygen. All members, however, had a say in each aspect of the practical. </w:t>
+      </w:r>
+      <w:r>
+        <w:br/>
+      </w:r>
+      <w:r>
+        <w:lastRenderedPageBreak/>
         <w:t>Committing helped us collaborate as a member who wants to see update some code can modify the most recent code that was committed. We also collaborated by using the “Issues” tab, which allowed us to remember what needs to be implemented and notify others of bugs/errors that may have been found.</w:t>
       </w:r>
       <w:r>
@@ -1501,9 +1276,9 @@
 <file path=word/numbering.xml><?xml version="1.0" encoding="utf-8"?>
 <w:numbering xmlns:wpc="http://schemas.microsoft.com/office/word/2010/wordprocessingCanvas" xmlns:cx="http://schemas.microsoft.com/office/drawing/2014/chartex" xmlns:cx1="http://schemas.microsoft.com/office/drawing/2015/9/8/chartex" xmlns:cx2="http://schemas.microsoft.com/office/drawing/2015/10/21/chartex" xmlns:cx3="http://schemas.microsoft.com/office/drawing/2016/5/9/chartex" xmlns:cx4="http://schemas.microsoft.com/office/drawing/2016/5/10/chartex" xmlns:cx5="http://schemas.microsoft.com/office/drawing/2016/5/11/chartex" xmlns:cx6="http://schemas.microsoft.com/office/drawing/2016/5/12/chartex" xmlns:cx7="http://schemas.microsoft.com/office/drawing/2016/5/13/chartex" xmlns:cx8="http://schemas.microsoft.com/office/drawing/2016/5/14/chartex" xmlns:mc="http://schemas.openxmlformats.org/markup-compatibility/2006" xmlns:m="http://schemas.openxmlformats.org/officeDocument/2006/math" xmlns:aink="http://schemas.microsoft.com/office/drawing/2016/ink" xmlns:am3d="http://schemas.microsoft.com/office/drawing/2017/model3d" xmlns:oel="http://schemas.microsoft.com/office/2019/extlst" xmlns:r="http://schemas.openxmlformats.org/officeDocument/2006/relationships" xmlns:wp14="http://schemas.microsoft.com/office/word/2010/wordprocessingDrawing" xmlns:wp="http://schemas.openxmlformats.org/drawingml/2006/wordprocessingDrawing" xmlns:wpg="http://schemas.microsoft.com/office/word/2010/wordprocessingGroup" xmlns:wpi="http://schemas.microsoft.com/office/word/2010/wordprocessingInk" xmlns:wps="http://schemas.microsoft.com/office/word/2010/wordprocessingShape" xmlns:o="urn:schemas-microsoft-com:office:office" xmlns:v="urn:schemas-microsoft-com:vml" xmlns:w10="urn:schemas-microsoft-com:office:word" xmlns:w="http://schemas.openxmlformats.org/wordprocessingml/2006/main" xmlns:w14="http://schemas.microsoft.com/office/word/2010/wordml" xmlns:w15="http://schemas.microsoft.com/office/word/2012/wordml" xmlns:w16cex="http://schemas.microsoft.com/office/word/2018/wordml/cex" xmlns:w16cid="http://schemas.microsoft.com/office/word/2016/wordml/cid" xmlns:w16="http://schemas.microsoft.com/office/word/2018/wordml" xmlns:w16sdtdh="http://schemas.microsoft.com/office/word/2020/wordml/sdtdatahash" xmlns:w16sdtfl="http://schemas.microsoft.com/office/word/2024/wordml/sdtformatlock" xmlns:w16se="http://schemas.microsoft.com/office/word/2015/wordml/symex" xmlns:w16du="http://schemas.microsoft.com/office/word/2023/wordml/word16du" xmlns:wne="http://schemas.microsoft.com/office/word/2006/wordml" mc:Ignorable="w14 w15 w16se w16cid w16 w16cex w16sdtdh w16sdtfl w16du wp14">
   <w:abstractNum w:abstractNumId="0" w15:restartNumberingAfterBreak="0">
-    <w:nsid w:val="67B31CBF"/>
+    <w:nsid w:val="416509BF"/>
     <w:multiLevelType w:val="hybridMultilevel"/>
-    <w:tmpl w:val="1AE88E2E"/>
+    <w:tmpl w:val="3D46F41E"/>
     <w:lvl w:ilvl="0" w:tplc="08090001">
       <w:start w:val="1"/>
       <w:numFmt w:val="bullet"/>
@@ -1613,7 +1388,123 @@
       </w:rPr>
     </w:lvl>
   </w:abstractNum>
+  <w:abstractNum w:abstractNumId="1" w15:restartNumberingAfterBreak="0">
+    <w:nsid w:val="67B31CBF"/>
+    <w:multiLevelType w:val="hybridMultilevel"/>
+    <w:tmpl w:val="1AE88E2E"/>
+    <w:lvl w:ilvl="0" w:tplc="08090001">
+      <w:start w:val="1"/>
+      <w:numFmt w:val="bullet"/>
+      <w:lvlText w:val=""/>
+      <w:lvlJc w:val="left"/>
+      <w:pPr>
+        <w:ind w:left="720" w:hanging="360"/>
+      </w:pPr>
+      <w:rPr>
+        <w:rFonts w:ascii="Symbol" w:hAnsi="Symbol" w:hint="default"/>
+      </w:rPr>
+    </w:lvl>
+    <w:lvl w:ilvl="1" w:tplc="08090003" w:tentative="1">
+      <w:start w:val="1"/>
+      <w:numFmt w:val="bullet"/>
+      <w:lvlText w:val="o"/>
+      <w:lvlJc w:val="left"/>
+      <w:pPr>
+        <w:ind w:left="1440" w:hanging="360"/>
+      </w:pPr>
+      <w:rPr>
+        <w:rFonts w:ascii="Courier New" w:hAnsi="Courier New" w:cs="Courier New" w:hint="default"/>
+      </w:rPr>
+    </w:lvl>
+    <w:lvl w:ilvl="2" w:tplc="08090005" w:tentative="1">
+      <w:start w:val="1"/>
+      <w:numFmt w:val="bullet"/>
+      <w:lvlText w:val=""/>
+      <w:lvlJc w:val="left"/>
+      <w:pPr>
+        <w:ind w:left="2160" w:hanging="360"/>
+      </w:pPr>
+      <w:rPr>
+        <w:rFonts w:ascii="Wingdings" w:hAnsi="Wingdings" w:hint="default"/>
+      </w:rPr>
+    </w:lvl>
+    <w:lvl w:ilvl="3" w:tplc="08090001" w:tentative="1">
+      <w:start w:val="1"/>
+      <w:numFmt w:val="bullet"/>
+      <w:lvlText w:val=""/>
+      <w:lvlJc w:val="left"/>
+      <w:pPr>
+        <w:ind w:left="2880" w:hanging="360"/>
+      </w:pPr>
+      <w:rPr>
+        <w:rFonts w:ascii="Symbol" w:hAnsi="Symbol" w:hint="default"/>
+      </w:rPr>
+    </w:lvl>
+    <w:lvl w:ilvl="4" w:tplc="08090003" w:tentative="1">
+      <w:start w:val="1"/>
+      <w:numFmt w:val="bullet"/>
+      <w:lvlText w:val="o"/>
+      <w:lvlJc w:val="left"/>
+      <w:pPr>
+        <w:ind w:left="3600" w:hanging="360"/>
+      </w:pPr>
+      <w:rPr>
+        <w:rFonts w:ascii="Courier New" w:hAnsi="Courier New" w:cs="Courier New" w:hint="default"/>
+      </w:rPr>
+    </w:lvl>
+    <w:lvl w:ilvl="5" w:tplc="08090005" w:tentative="1">
+      <w:start w:val="1"/>
+      <w:numFmt w:val="bullet"/>
+      <w:lvlText w:val=""/>
+      <w:lvlJc w:val="left"/>
+      <w:pPr>
+        <w:ind w:left="4320" w:hanging="360"/>
+      </w:pPr>
+      <w:rPr>
+        <w:rFonts w:ascii="Wingdings" w:hAnsi="Wingdings" w:hint="default"/>
+      </w:rPr>
+    </w:lvl>
+    <w:lvl w:ilvl="6" w:tplc="08090001" w:tentative="1">
+      <w:start w:val="1"/>
+      <w:numFmt w:val="bullet"/>
+      <w:lvlText w:val=""/>
+      <w:lvlJc w:val="left"/>
+      <w:pPr>
+        <w:ind w:left="5040" w:hanging="360"/>
+      </w:pPr>
+      <w:rPr>
+        <w:rFonts w:ascii="Symbol" w:hAnsi="Symbol" w:hint="default"/>
+      </w:rPr>
+    </w:lvl>
+    <w:lvl w:ilvl="7" w:tplc="08090003" w:tentative="1">
+      <w:start w:val="1"/>
+      <w:numFmt w:val="bullet"/>
+      <w:lvlText w:val="o"/>
+      <w:lvlJc w:val="left"/>
+      <w:pPr>
+        <w:ind w:left="5760" w:hanging="360"/>
+      </w:pPr>
+      <w:rPr>
+        <w:rFonts w:ascii="Courier New" w:hAnsi="Courier New" w:cs="Courier New" w:hint="default"/>
+      </w:rPr>
+    </w:lvl>
+    <w:lvl w:ilvl="8" w:tplc="08090005" w:tentative="1">
+      <w:start w:val="1"/>
+      <w:numFmt w:val="bullet"/>
+      <w:lvlText w:val=""/>
+      <w:lvlJc w:val="left"/>
+      <w:pPr>
+        <w:ind w:left="6480" w:hanging="360"/>
+      </w:pPr>
+      <w:rPr>
+        <w:rFonts w:ascii="Wingdings" w:hAnsi="Wingdings" w:hint="default"/>
+      </w:rPr>
+    </w:lvl>
+  </w:abstractNum>
   <w:num w:numId="1" w16cid:durableId="1744059141">
+    <w:abstractNumId w:val="1"/>
+  </w:num>
+  <w:num w:numId="2" w16cid:durableId="1172791810">
     <w:abstractNumId w:val="0"/>
   </w:num>
 </w:numbering>

</xml_diff>